<commit_message>
file 3 and add nhat ky
</commit_message>
<xml_diff>
--- a/DOC/2_ApplicationDevelopment_QAs.docx
+++ b/DOC/2_ApplicationDevelopment_QAs.docx
@@ -607,6 +607,7 @@
           <w:rFonts w:ascii="Times New Roman" w:hAnsi="Times New Roman" w:cs="Times New Roman"/>
           <w:b/>
           <w:bCs/>
+          <w:noProof/>
           <w:sz w:val="26"/>
           <w:szCs w:val="26"/>
         </w:rPr>
@@ -694,6 +695,7 @@
           <w:rFonts w:ascii="Times New Roman" w:hAnsi="Times New Roman" w:cs="Times New Roman"/>
           <w:b/>
           <w:bCs/>
+          <w:noProof/>
           <w:sz w:val="26"/>
           <w:szCs w:val="26"/>
         </w:rPr>
@@ -787,6 +789,7 @@
           <w:rFonts w:ascii="Times New Roman" w:hAnsi="Times New Roman" w:cs="Times New Roman"/>
           <w:b/>
           <w:bCs/>
+          <w:noProof/>
           <w:sz w:val="26"/>
           <w:szCs w:val="26"/>
         </w:rPr>
@@ -873,6 +876,7 @@
           <w:rFonts w:ascii="Times New Roman" w:hAnsi="Times New Roman" w:cs="Times New Roman"/>
           <w:b/>
           <w:bCs/>
+          <w:noProof/>
           <w:sz w:val="26"/>
           <w:szCs w:val="26"/>
         </w:rPr>
@@ -977,6 +981,7 @@
           <w:rFonts w:ascii="Times New Roman" w:hAnsi="Times New Roman" w:cs="Times New Roman"/>
           <w:b/>
           <w:bCs/>
+          <w:noProof/>
           <w:sz w:val="26"/>
           <w:szCs w:val="26"/>
         </w:rPr>
@@ -1075,6 +1080,7 @@
           <w:rFonts w:ascii="Times New Roman" w:hAnsi="Times New Roman" w:cs="Times New Roman"/>
           <w:b/>
           <w:bCs/>
+          <w:noProof/>
           <w:sz w:val="26"/>
           <w:szCs w:val="26"/>
         </w:rPr>
@@ -1220,6 +1226,7 @@
           <w:rFonts w:ascii="Times New Roman" w:hAnsi="Times New Roman" w:cs="Times New Roman"/>
           <w:b/>
           <w:bCs/>
+          <w:noProof/>
           <w:sz w:val="26"/>
           <w:szCs w:val="26"/>
         </w:rPr>
@@ -4388,6 +4395,7 @@
           <w:rFonts w:ascii="Times New Roman" w:hAnsi="Times New Roman" w:cs="Times New Roman"/>
           <w:i/>
           <w:iCs/>
+          <w:noProof/>
           <w:sz w:val="26"/>
           <w:szCs w:val="26"/>
         </w:rPr>
@@ -4454,6 +4462,7 @@
           <w:rFonts w:ascii="Times New Roman" w:hAnsi="Times New Roman" w:cs="Times New Roman"/>
           <w:i/>
           <w:iCs/>
+          <w:noProof/>
           <w:sz w:val="26"/>
           <w:szCs w:val="26"/>
         </w:rPr>
@@ -6289,6 +6298,41 @@
     </w:p>
     <w:p>
       <w:pPr>
+        <w:rPr>
+          <w:rFonts w:ascii="Times New Roman" w:hAnsi="Times New Roman" w:cs="Times New Roman"/>
+          <w:sz w:val="26"/>
+          <w:szCs w:val="26"/>
+        </w:rPr>
+      </w:pPr>
+      <w:r>
+        <w:rPr>
+          <w:rFonts w:ascii="Times New Roman" w:hAnsi="Times New Roman" w:cs="Times New Roman"/>
+          <w:i/>
+          <w:iCs/>
+          <w:sz w:val="26"/>
+          <w:szCs w:val="26"/>
+        </w:rPr>
+        <w:t xml:space="preserve">Quản lý mã giảm giá: </w:t>
+      </w:r>
+      <w:r>
+        <w:rPr>
+          <w:rFonts w:ascii="Times New Roman" w:hAnsi="Times New Roman" w:cs="Times New Roman"/>
+          <w:sz w:val="26"/>
+          <w:szCs w:val="26"/>
+        </w:rPr>
+        <w:t>Thêm, sửa, xóa</w:t>
+      </w:r>
+      <w:r>
+        <w:rPr>
+          <w:rFonts w:ascii="Times New Roman" w:hAnsi="Times New Roman" w:cs="Times New Roman"/>
+          <w:sz w:val="26"/>
+          <w:szCs w:val="26"/>
+        </w:rPr>
+        <w:t xml:space="preserve"> các mã giảm giá và chương trình khuyến mãi.</w:t>
+      </w:r>
+    </w:p>
+    <w:p>
+      <w:pPr>
         <w:pStyle w:val="ListParagraph"/>
         <w:numPr>
           <w:ilvl w:val="0"/>
@@ -6329,15 +6373,96 @@
           <w:sz w:val="26"/>
           <w:szCs w:val="26"/>
         </w:rPr>
-        <w:t>Quản lý kho (Phụ kiện/Thức ăn):</w:t>
-      </w:r>
-      <w:r>
-        <w:rPr>
-          <w:rFonts w:ascii="Times New Roman" w:hAnsi="Times New Roman" w:cs="Times New Roman"/>
-          <w:sz w:val="26"/>
-          <w:szCs w:val="26"/>
-        </w:rPr>
-        <w:t xml:space="preserve"> Cập nhật số lượng nhập/xuất kho, cảnh báo khi hàng trong kho sắp hết.</w:t>
+        <w:t>Quản lý nhập hàng:</w:t>
+      </w:r>
+      <w:r>
+        <w:rPr>
+          <w:rFonts w:ascii="Times New Roman" w:hAnsi="Times New Roman" w:cs="Times New Roman"/>
+          <w:sz w:val="26"/>
+          <w:szCs w:val="26"/>
+        </w:rPr>
+        <w:t xml:space="preserve"> Lập phiếu nhập, chọn nhà cung cấp, ghi nhận sản phẩm, số lượng và giá nhập.</w:t>
+      </w:r>
+    </w:p>
+    <w:p>
+      <w:pPr>
+        <w:rPr>
+          <w:rFonts w:ascii="Times New Roman" w:hAnsi="Times New Roman" w:cs="Times New Roman"/>
+          <w:sz w:val="26"/>
+          <w:szCs w:val="26"/>
+        </w:rPr>
+      </w:pPr>
+      <w:r>
+        <w:rPr>
+          <w:rFonts w:ascii="Times New Roman" w:hAnsi="Times New Roman" w:cs="Times New Roman"/>
+          <w:i/>
+          <w:iCs/>
+          <w:sz w:val="26"/>
+          <w:szCs w:val="26"/>
+        </w:rPr>
+        <w:t>Quản lý tồn kho:</w:t>
+      </w:r>
+      <w:r>
+        <w:rPr>
+          <w:rFonts w:ascii="Times New Roman" w:hAnsi="Times New Roman" w:cs="Times New Roman"/>
+          <w:sz w:val="26"/>
+          <w:szCs w:val="26"/>
+        </w:rPr>
+        <w:t xml:space="preserve"> Theo dõi số lượng tồn, kiểm kê và điều chỉnh chênh lệch.</w:t>
+      </w:r>
+    </w:p>
+    <w:p>
+      <w:pPr>
+        <w:rPr>
+          <w:rFonts w:ascii="Times New Roman" w:hAnsi="Times New Roman" w:cs="Times New Roman"/>
+          <w:sz w:val="26"/>
+          <w:szCs w:val="26"/>
+        </w:rPr>
+      </w:pPr>
+      <w:r>
+        <w:rPr>
+          <w:rFonts w:ascii="Times New Roman" w:hAnsi="Times New Roman" w:cs="Times New Roman"/>
+          <w:i/>
+          <w:iCs/>
+          <w:sz w:val="26"/>
+          <w:szCs w:val="26"/>
+        </w:rPr>
+        <w:t>Quản lý nhà cung cấp:</w:t>
+      </w:r>
+      <w:r>
+        <w:rPr>
+          <w:rFonts w:ascii="Times New Roman" w:hAnsi="Times New Roman" w:cs="Times New Roman"/>
+          <w:sz w:val="26"/>
+          <w:szCs w:val="26"/>
+        </w:rPr>
+        <w:t xml:space="preserve"> Tra cứu thông tin nhà cung cấp và lịch sử nhập hàng.</w:t>
+      </w:r>
+    </w:p>
+    <w:p>
+      <w:pPr>
+        <w:rPr>
+          <w:rFonts w:ascii="Times New Roman" w:hAnsi="Times New Roman" w:cs="Times New Roman"/>
+          <w:sz w:val="26"/>
+          <w:szCs w:val="26"/>
+        </w:rPr>
+      </w:pPr>
+      <w:r>
+        <w:rPr>
+          <w:rFonts w:ascii="Times New Roman" w:hAnsi="Times New Roman" w:cs="Times New Roman"/>
+          <w:i/>
+          <w:iCs/>
+          <w:sz w:val="26"/>
+          <w:szCs w:val="26"/>
+        </w:rPr>
+        <w:t>Cảnh báo tồn kho:</w:t>
+      </w:r>
+      <w:r>
+        <w:rPr>
+          <w:rFonts w:ascii="Times New Roman" w:hAnsi="Times New Roman" w:cs="Times New Roman"/>
+          <w:sz w:val="26"/>
+          <w:szCs w:val="26"/>
+        </w:rPr>
+        <w:t xml:space="preserve"> Theo dõi sản phẩm sắp hết hàng.</w:t>
       </w:r>
     </w:p>
     <w:p>
@@ -6489,7 +6614,27 @@
           <w:sz w:val="26"/>
           <w:szCs w:val="26"/>
         </w:rPr>
-        <w:t>Hồ sơ thú cưng:</w:t>
+        <w:t>Hồ sơ thú cưng</w:t>
+      </w:r>
+      <w:r>
+        <w:rPr>
+          <w:rFonts w:ascii="Times New Roman" w:hAnsi="Times New Roman" w:cs="Times New Roman"/>
+          <w:i/>
+          <w:iCs/>
+          <w:sz w:val="26"/>
+          <w:szCs w:val="26"/>
+        </w:rPr>
+        <w:t xml:space="preserve"> khách hàng</w:t>
+      </w:r>
+      <w:r>
+        <w:rPr>
+          <w:rFonts w:ascii="Times New Roman" w:hAnsi="Times New Roman" w:cs="Times New Roman"/>
+          <w:i/>
+          <w:iCs/>
+          <w:sz w:val="26"/>
+          <w:szCs w:val="26"/>
+        </w:rPr>
+        <w:t>:</w:t>
       </w:r>
       <w:r>
         <w:rPr>
@@ -6630,6 +6775,7 @@
           <w:sz w:val="26"/>
           <w:szCs w:val="26"/>
         </w:rPr>
+        <w:lastRenderedPageBreak/>
         <w:t>Nhóm chức năng chung của hệ thống:</w:t>
       </w:r>
     </w:p>
@@ -6685,141 +6831,6 @@
           <w:szCs w:val="26"/>
         </w:rPr>
         <w:t xml:space="preserve"> Nhân viên có thể truy cập để xem lịch làm việc trong tuần.</w:t>
-      </w:r>
-    </w:p>
-    <w:p>
-      <w:pPr>
-        <w:pStyle w:val="ListParagraph"/>
-        <w:numPr>
-          <w:ilvl w:val="0"/>
-          <w:numId w:val="48"/>
-        </w:numPr>
-        <w:rPr>
-          <w:rFonts w:ascii="Times New Roman" w:hAnsi="Times New Roman" w:cs="Times New Roman"/>
-          <w:b/>
-          <w:bCs/>
-          <w:sz w:val="26"/>
-          <w:szCs w:val="26"/>
-        </w:rPr>
-      </w:pPr>
-      <w:r>
-        <w:rPr>
-          <w:rFonts w:ascii="Times New Roman" w:hAnsi="Times New Roman" w:cs="Times New Roman"/>
-          <w:b/>
-          <w:bCs/>
-          <w:sz w:val="26"/>
-          <w:szCs w:val="26"/>
-        </w:rPr>
-        <w:t>Nhóm chức năng dành cho Nhân viên kho:</w:t>
-      </w:r>
-    </w:p>
-    <w:p>
-      <w:pPr>
-        <w:rPr>
-          <w:rFonts w:ascii="Times New Roman" w:hAnsi="Times New Roman" w:cs="Times New Roman"/>
-          <w:sz w:val="26"/>
-          <w:szCs w:val="26"/>
-        </w:rPr>
-      </w:pPr>
-      <w:r>
-        <w:rPr>
-          <w:rFonts w:ascii="Times New Roman" w:hAnsi="Times New Roman" w:cs="Times New Roman"/>
-          <w:i/>
-          <w:iCs/>
-          <w:sz w:val="26"/>
-          <w:szCs w:val="26"/>
-        </w:rPr>
-        <w:lastRenderedPageBreak/>
-        <w:t>Quản lý nhập hàng:</w:t>
-      </w:r>
-      <w:r>
-        <w:rPr>
-          <w:rFonts w:ascii="Times New Roman" w:hAnsi="Times New Roman" w:cs="Times New Roman"/>
-          <w:sz w:val="26"/>
-          <w:szCs w:val="26"/>
-        </w:rPr>
-        <w:t xml:space="preserve"> Lập phiếu nhập, chọn nhà cung cấp, ghi nhận sản phẩm, số lượng và giá nhập.</w:t>
-      </w:r>
-    </w:p>
-    <w:p>
-      <w:pPr>
-        <w:rPr>
-          <w:rFonts w:ascii="Times New Roman" w:hAnsi="Times New Roman" w:cs="Times New Roman"/>
-          <w:sz w:val="26"/>
-          <w:szCs w:val="26"/>
-        </w:rPr>
-      </w:pPr>
-      <w:r>
-        <w:rPr>
-          <w:rFonts w:ascii="Times New Roman" w:hAnsi="Times New Roman" w:cs="Times New Roman"/>
-          <w:i/>
-          <w:iCs/>
-          <w:sz w:val="26"/>
-          <w:szCs w:val="26"/>
-        </w:rPr>
-        <w:t>Quản lý tồn kho:</w:t>
-      </w:r>
-      <w:r>
-        <w:rPr>
-          <w:rFonts w:ascii="Times New Roman" w:hAnsi="Times New Roman" w:cs="Times New Roman"/>
-          <w:sz w:val="26"/>
-          <w:szCs w:val="26"/>
-        </w:rPr>
-        <w:t xml:space="preserve"> Theo dõi số lượng tồn, kiểm kê và điều chỉnh chênh lệch.</w:t>
-      </w:r>
-    </w:p>
-    <w:p>
-      <w:pPr>
-        <w:rPr>
-          <w:rFonts w:ascii="Times New Roman" w:hAnsi="Times New Roman" w:cs="Times New Roman"/>
-          <w:sz w:val="26"/>
-          <w:szCs w:val="26"/>
-        </w:rPr>
-      </w:pPr>
-      <w:r>
-        <w:rPr>
-          <w:rFonts w:ascii="Times New Roman" w:hAnsi="Times New Roman" w:cs="Times New Roman"/>
-          <w:i/>
-          <w:iCs/>
-          <w:sz w:val="26"/>
-          <w:szCs w:val="26"/>
-        </w:rPr>
-        <w:t>Quản lý nhà cung cấp:</w:t>
-      </w:r>
-      <w:r>
-        <w:rPr>
-          <w:rFonts w:ascii="Times New Roman" w:hAnsi="Times New Roman" w:cs="Times New Roman"/>
-          <w:sz w:val="26"/>
-          <w:szCs w:val="26"/>
-        </w:rPr>
-        <w:t xml:space="preserve"> Tra cứu thông tin nhà cung cấp và lịch sử nhập hàng.</w:t>
-      </w:r>
-    </w:p>
-    <w:p>
-      <w:pPr>
-        <w:rPr>
-          <w:rFonts w:ascii="Times New Roman" w:hAnsi="Times New Roman" w:cs="Times New Roman"/>
-          <w:sz w:val="26"/>
-          <w:szCs w:val="26"/>
-        </w:rPr>
-      </w:pPr>
-      <w:r>
-        <w:rPr>
-          <w:rFonts w:ascii="Times New Roman" w:hAnsi="Times New Roman" w:cs="Times New Roman"/>
-          <w:i/>
-          <w:iCs/>
-          <w:sz w:val="26"/>
-          <w:szCs w:val="26"/>
-        </w:rPr>
-        <w:t>Cảnh báo tồn kho:</w:t>
-      </w:r>
-      <w:r>
-        <w:rPr>
-          <w:rFonts w:ascii="Times New Roman" w:hAnsi="Times New Roman" w:cs="Times New Roman"/>
-          <w:sz w:val="26"/>
-          <w:szCs w:val="26"/>
-        </w:rPr>
-        <w:t xml:space="preserve"> Theo dõi sản phẩm sắp hết hàng.</w:t>
       </w:r>
     </w:p>
     <w:p/>
@@ -13799,6 +13810,7 @@
   <w:style w:type="character" w:default="1" w:styleId="DefaultParagraphFont">
     <w:name w:val="Default Paragraph Font"/>
     <w:uiPriority w:val="1"/>
+    <w:semiHidden/>
     <w:unhideWhenUsed/>
   </w:style>
   <w:style w:type="table" w:default="1" w:styleId="TableNormal">

</xml_diff>